<commit_message>
Add species holdout failure audit
</commit_message>
<xml_diff>
--- a/manuscript/Plant_CellFM_v9_final_submission_zh_v1.docx
+++ b/manuscript/Plant_CellFM_v9_final_submission_zh_v1.docx
@@ -41,7 +41,7 @@
           <w:b w:val="0"/>
           <w:sz w:val="21"/>
         </w:rPr>
-        <w:t>生成时间：2026-07-30 17:33 Asia/Shanghai</w:t>
+        <w:t>生成时间：2026-07-30 18:26 Asia/Shanghai</w:t>
       </w:r>
     </w:p>
     <w:p>
@@ -125,7 +125,7 @@
           <w:b w:val="0"/>
           <w:sz w:val="21"/>
         </w:rPr>
-        <w:t>当前冻结版本覆盖 56 条 manifest 记录、29 个公开数据集、21 个植物物种、约 1378 万个细胞和约 153 万个源基因，checkpoint 共享基因词表为 280,747 个基因。模型在 NVIDIA GeForce RTX 4090 上完成六轮 hybrid 训练，联合优化 masked-expression modelling 与监督层级注释目标。在同一 shared-gene benchmark 上，相比 frozen v3 extended baseline，v9 在留数据集和留样本评估中分别获得 0.4490 和 0.6200 的 all-cell accuracy，较基线提升 24.70 和 20.45 个百分点；在物种名归一化后的严格留物种开放集评估中，v9 all-cell accuracy 为 0.2354、coverage 为 0.5590、known-label conditional accuracy 为 0.4210。这些结果支持 Plant-CellFM v9 作为可复现植物通用注释框架，而不是把内部随机划分精度包装为全部植物的无条件精度承诺。</w:t>
+        <w:t>当前冻结版本覆盖 56 条 manifest 记录、29 个公开数据集、21 个植物物种、约 1378 万个细胞和约 153 万个源基因，checkpoint 共享基因词表为 280,747 个基因。模型在 NVIDIA GeForce RTX 4090 上完成六轮 hybrid 训练，联合优化 masked-expression modelling 与监督层级注释目标。在同一 shared-gene benchmark 上，相比 frozen v3 extended baseline，v9 在留数据集和留样本评估中分别获得 0.4490 和 0.6200 的 all-cell accuracy，较基线提升 24.70 和 20.45 个百分点；在物种名归一化后的严格留物种开放集评估中，v9 all-cell accuracy 为 0.2354、coverage 为 0.5590、known-label conditional accuracy 为 0.4210。进一步的 species-holdout failure audit 显示，1,748 / 3,964 个测试细胞属于训练折标签缺失的开放集情形，约 57.67% 的 all-cell 错误可归因于标签覆盖缺口。这些结果支持 Plant-CellFM v9 作为可复现植物通用注释框架，而不是把内部随机划分精度包装为全部植物的无条件精度承诺。</w:t>
       </w:r>
     </w:p>
     <w:p>
@@ -1338,6 +1338,20 @@
           <w:sz w:val="21"/>
         </w:rPr>
         <w:t>留物种结果经过物种名归一化：`Arabidopsis_thaliana` 与 `Arabidopsis thaliana` 在 split 前合并为同一物种组。这一修正让结果更严格，也更适合发表。从结果看，v9 的强项主要体现在留数据集和留样本场景，说明模型对新数据来源和新样本具有稳定迁移能力；留物种开放集提升较小，但仍优于同一 shared-gene subset 上的 v3 extended baseline。因此，本文将 Plant-CellFM v9 表述为可复现的植物通用基础模型和适配框架，而不是声称已经解决所有植物物种的满覆盖零样本注释。</w:t>
+      </w:r>
+    </w:p>
+    <w:p>
+      <w:pPr>
+        <w:spacing w:line="276" w:lineRule="auto" w:after="120"/>
+        <w:ind w:firstLine="420"/>
+      </w:pPr>
+      <w:r>
+        <w:rPr>
+          <w:rFonts w:ascii="Microsoft YaHei" w:hAnsi="Microsoft YaHei"/>
+          <w:b w:val="0"/>
+          <w:sz w:val="21"/>
+        </w:rPr>
+        <w:t>`release_metadata/species_holdout_failure_audit_v9.md` 对留物种结果做了进一步拆解。在 3,964 个测试细胞中，2,216 个细胞的参考标签在训练折中出现，1,748 个细胞属于 open-set label absence；该部分占 all-cell 错误估计的 57.67%。物种级诊断同时显示，Eutrema salsugineum 和 Triticum aestivum 在当前标签覆盖与组织上下文下具有较强迁移表现，Catharanthus roseus 则属于高覆盖但已知标签迁移失败的主要靶点，Gossypium hirsutum 需要先完成标签本体映射后才能解释准确率。因此，留物种指标在本文中承担的是开放集泛化审计和下一轮改进靶点定位，而不是全植物无条件高精度声明。</w:t>
       </w:r>
     </w:p>
     <w:p>
@@ -3737,6 +3751,20 @@
           <w:b w:val="0"/>
           <w:sz w:val="21"/>
         </w:rPr>
+        <w:t>species-holdout failure audit：`release_metadata/species_holdout_failure_audit_v9.md`</w:t>
+      </w:r>
+    </w:p>
+    <w:p>
+      <w:pPr>
+        <w:spacing w:line="276" w:lineRule="auto" w:after="120"/>
+        <w:ind w:firstLine="420"/>
+      </w:pPr>
+      <w:r>
+        <w:rPr>
+          <w:rFonts w:ascii="Microsoft YaHei" w:hAnsi="Microsoft YaHei"/>
+          <w:b w:val="0"/>
+          <w:sz w:val="21"/>
+        </w:rPr>
         <w:t>Arabidopsis root literature anchor：`release_metadata/arabidopsis_root_literature_anchor_v9.md`</w:t>
       </w:r>
     </w:p>
@@ -3821,7 +3849,7 @@
           <w:b w:val="0"/>
           <w:sz w:val="21"/>
         </w:rPr>
-        <w:t>2. 在同一 shared-gene benchmark 上，v9 在留数据集、留样本和归一化留物种协议中均优于 v3 extended baseline。</w:t>
+        <w:t>2. 在同一 shared-gene benchmark 上，v9 在留数据集、留样本和归一化留物种协议中均优于 v3 extended baseline；留物种结果同时提供物种级失败审计。</w:t>
       </w:r>
     </w:p>
     <w:p>
@@ -3961,7 +3989,7 @@
           <w:b w:val="0"/>
           <w:sz w:val="21"/>
         </w:rPr>
-        <w:t>Plant-CellFM v9 已经形成一版可提交、可演示、可复现的植物通用单细胞注释基础模型。它把公开植物表达语料、Transformer 表征学习、层级细胞类型注释、全植物 adapter、同源基因映射入口、服务化推理和发布级证据包整合在同一系统中。当前最稳妥的投稿定位是计算方法与资源论文：模型不是只做雪莲，而是面向全植物；雪莲不是被夸大为图谱成果，而是作为目标物种适配入口；性能结论不依赖内部随机拆分，而以 leave-dataset、leave-sample、物种名归一化 leave-species benchmark、Seurat 外部对照和 Arabidopsis root 生物学案例为核心证据。</w:t>
+        <w:t>Plant-CellFM v9 已经形成一版可提交、可演示、可复现的植物通用单细胞注释基础模型。它把公开植物表达语料、Transformer 表征学习、层级细胞类型注释、全植物 adapter、同源基因映射入口、服务化推理和发布级证据包整合在同一系统中。当前最稳妥的投稿定位是计算方法与资源论文：模型不是只做雪莲，而是面向全植物；雪莲不是被夸大为图谱成果，而是作为目标物种适配入口；性能结论不依赖内部随机拆分，而以 leave-dataset、leave-sample、物种名归一化 leave-species benchmark、species-holdout failure audit、Seurat 外部对照和 Arabidopsis root 生物学案例为核心证据。</w:t>
       </w:r>
     </w:p>
     <w:p>
@@ -4079,7 +4107,7 @@
                 <w:b w:val="0"/>
                 <w:sz w:val="16"/>
               </w:rPr>
-              <w:t>主文将留物种结果写成开放集迁移证据，而不是全部植物满覆盖断言；同时报告 all-cell accuracy、coverage 和 known-label conditional metrics。</w:t>
+              <w:t>主文将留物种结果写成开放集迁移证据，而不是全部植物满覆盖断言；同时报告 all-cell accuracy、coverage、known-label conditional metrics 和 species-holdout failure audit。</w:t>
             </w:r>
           </w:p>
         </w:tc>
@@ -4094,7 +4122,7 @@
                 <w:b w:val="0"/>
                 <w:sz w:val="16"/>
               </w:rPr>
-              <w:t>Plant-CellFM v9 在同一 shared-gene benchmark 上稳定优于 v3 extended baseline，并提供可复现的全植物适配框架。</w:t>
+              <w:t>Plant-CellFM v9 在同一 shared-gene benchmark 上优于 v3 extended baseline，并提供可复现的全植物适配框架与可审计物种级失败模式。</w:t>
             </w:r>
           </w:p>
         </w:tc>
@@ -4109,7 +4137,7 @@
                 <w:b w:val="0"/>
                 <w:sz w:val="16"/>
               </w:rPr>
-              <w:t>release_metadata/v9_benchmarks/v9_lora_vs_v3_shared_comparison.json</w:t>
+              <w:t>release_metadata/v9_benchmarks/v9_lora_vs_v3_shared_comparison.json; release_metadata/species_holdout_failure_audit_v9.md</w:t>
             </w:r>
           </w:p>
         </w:tc>

</xml_diff>

<commit_message>
Add species ontology coverage audit
</commit_message>
<xml_diff>
--- a/manuscript/Plant_CellFM_v9_final_submission_zh_v1.docx
+++ b/manuscript/Plant_CellFM_v9_final_submission_zh_v1.docx
@@ -41,7 +41,7 @@
           <w:b w:val="0"/>
           <w:sz w:val="21"/>
         </w:rPr>
-        <w:t>生成时间：2026-07-30 18:26 Asia/Shanghai</w:t>
+        <w:t>生成时间：2026-07-30 19:04 Asia/Shanghai</w:t>
       </w:r>
     </w:p>
     <w:p>
@@ -125,7 +125,7 @@
           <w:b w:val="0"/>
           <w:sz w:val="21"/>
         </w:rPr>
-        <w:t>当前冻结版本覆盖 56 条 manifest 记录、29 个公开数据集、21 个植物物种、约 1378 万个细胞和约 153 万个源基因，checkpoint 共享基因词表为 280,747 个基因。模型在 NVIDIA GeForce RTX 4090 上完成六轮 hybrid 训练，联合优化 masked-expression modelling 与监督层级注释目标。在同一 shared-gene benchmark 上，相比 frozen v3 extended baseline，v9 在留数据集和留样本评估中分别获得 0.4490 和 0.6200 的 all-cell accuracy，较基线提升 24.70 和 20.45 个百分点；在物种名归一化后的严格留物种开放集评估中，v9 all-cell accuracy 为 0.2354、coverage 为 0.5590、known-label conditional accuracy 为 0.4210。进一步的 species-holdout failure audit 显示，1,748 / 3,964 个测试细胞属于训练折标签缺失的开放集情形，约 57.67% 的 all-cell 错误可归因于标签覆盖缺口。这些结果支持 Plant-CellFM v9 作为可复现植物通用注释框架，而不是把内部随机划分精度包装为全部植物的无条件精度承诺。</w:t>
+        <w:t>当前冻结版本覆盖 56 条 manifest 记录、29 个公开数据集、21 个植物物种、约 1378 万个细胞和约 153 万个源基因，checkpoint 共享基因词表为 280,747 个基因。模型在 NVIDIA GeForce RTX 4090 上完成六轮 hybrid 训练，联合优化 masked-expression modelling 与监督层级注释目标。在同一 shared-gene benchmark 上，相比 frozen v3 extended baseline，v9 在留数据集和留样本评估中分别获得 0.4490 和 0.6200 的 all-cell accuracy，较基线提升 24.70 和 20.45 个百分点；在物种名归一化后的严格留物种开放集评估中，v9 all-cell accuracy 为 0.2354、coverage 为 0.5590、known-label conditional accuracy 为 0.4210。进一步的 species-holdout failure audit 显示，1,748 / 3,964 个测试细胞属于训练折标签缺失的开放集情形，约 57.67% 的 all-cell 错误可归因于标签覆盖缺口。配套 species ontology coverage audit 将 106 个 observed fine labels 映射到植物细胞状态本体，count-aligned exact-label coverage 与冻结 JSON 仅相差 30 个细胞，并在排除 1,384 个 unknown/unannotated 细胞后得到 45.26% 的 actionable ontology coverage。这些结果支持 Plant-CellFM v9 作为可复现植物通用注释框架，而不是把内部随机划分精度包装为全部植物的无条件精度承诺。</w:t>
       </w:r>
     </w:p>
     <w:p>
@@ -1352,6 +1352,20 @@
           <w:sz w:val="21"/>
         </w:rPr>
         <w:t>`release_metadata/species_holdout_failure_audit_v9.md` 对留物种结果做了进一步拆解。在 3,964 个测试细胞中，2,216 个细胞的参考标签在训练折中出现，1,748 个细胞属于 open-set label absence；该部分占 all-cell 错误估计的 57.67%。物种级诊断同时显示，Eutrema salsugineum 和 Triticum aestivum 在当前标签覆盖与组织上下文下具有较强迁移表现，Catharanthus roseus 则属于高覆盖但已知标签迁移失败的主要靶点，Gossypium hirsutum 需要先完成标签本体映射后才能解释准确率。因此，留物种指标在本文中承担的是开放集泛化审计和下一轮改进靶点定位，而不是全植物无条件高精度声明。</w:t>
+      </w:r>
+    </w:p>
+    <w:p>
+      <w:pPr>
+        <w:spacing w:line="276" w:lineRule="auto" w:after="120"/>
+        <w:ind w:firstLine="420"/>
+      </w:pPr>
+      <w:r>
+        <w:rPr>
+          <w:rFonts w:ascii="Microsoft YaHei" w:hAnsi="Microsoft YaHei"/>
+          <w:b w:val="0"/>
+          <w:sz w:val="21"/>
+        </w:rPr>
+        <w:t>`release_metadata/species_ontology_coverage_audit_v9.md` 进一步把这一问题转化为可复核的标签本体审计。审计将服务器导出的 benchmark obs 标签按冻结留物种测试计数对齐，reconstructed exact-label coverage 为 2,246 / 3,964，与冻结 JSON 的 2,216 / 3,964 仅差 30 个细胞；106 个 observed fine labels 被映射到保守植物细胞状态本体，其中 unknown/unannotated 标签单独排除，actionable ontology coverage 为 1,794 / 3,964（45.26%）。这一结果并不修改冻结准确率，而是说明下一轮 benchmark 应同时报告 literal fine-label 与 ontology-label 两套覆盖口径。</w:t>
       </w:r>
     </w:p>
     <w:p>
@@ -3765,6 +3779,34 @@
           <w:b w:val="0"/>
           <w:sz w:val="21"/>
         </w:rPr>
+        <w:t>species ontology coverage audit：`release_metadata/species_ontology_coverage_audit_v9.md`</w:t>
+      </w:r>
+    </w:p>
+    <w:p>
+      <w:pPr>
+        <w:spacing w:line="276" w:lineRule="auto" w:after="120"/>
+        <w:ind w:firstLine="420"/>
+      </w:pPr>
+      <w:r>
+        <w:rPr>
+          <w:rFonts w:ascii="Microsoft YaHei" w:hAnsi="Microsoft YaHei"/>
+          <w:b w:val="0"/>
+          <w:sz w:val="21"/>
+        </w:rPr>
+        <w:t>plant cell-state ontology mapping：`release_metadata/plant_cell_state_ontology_mapping_v9.tsv`</w:t>
+      </w:r>
+    </w:p>
+    <w:p>
+      <w:pPr>
+        <w:spacing w:line="276" w:lineRule="auto" w:after="120"/>
+        <w:ind w:firstLine="420"/>
+      </w:pPr>
+      <w:r>
+        <w:rPr>
+          <w:rFonts w:ascii="Microsoft YaHei" w:hAnsi="Microsoft YaHei"/>
+          <w:b w:val="0"/>
+          <w:sz w:val="21"/>
+        </w:rPr>
         <w:t>Arabidopsis root literature anchor：`release_metadata/arabidopsis_root_literature_anchor_v9.md`</w:t>
       </w:r>
     </w:p>
@@ -3849,7 +3891,7 @@
           <w:b w:val="0"/>
           <w:sz w:val="21"/>
         </w:rPr>
-        <w:t>2. 在同一 shared-gene benchmark 上，v9 在留数据集、留样本和归一化留物种协议中均优于 v3 extended baseline；留物种结果同时提供物种级失败审计。</w:t>
+        <w:t>2. 在同一 shared-gene benchmark 上，v9 在留数据集、留样本和归一化留物种协议中均优于 v3 extended baseline；留物种结果同时提供物种级失败审计和本体覆盖审计。</w:t>
       </w:r>
     </w:p>
     <w:p>
@@ -3989,7 +4031,7 @@
           <w:b w:val="0"/>
           <w:sz w:val="21"/>
         </w:rPr>
-        <w:t>Plant-CellFM v9 已经形成一版可提交、可演示、可复现的植物通用单细胞注释基础模型。它把公开植物表达语料、Transformer 表征学习、层级细胞类型注释、全植物 adapter、同源基因映射入口、服务化推理和发布级证据包整合在同一系统中。当前最稳妥的投稿定位是计算方法与资源论文：模型不是只做雪莲，而是面向全植物；雪莲不是被夸大为图谱成果，而是作为目标物种适配入口；性能结论不依赖内部随机拆分，而以 leave-dataset、leave-sample、物种名归一化 leave-species benchmark、species-holdout failure audit、Seurat 外部对照和 Arabidopsis root 生物学案例为核心证据。</w:t>
+        <w:t>Plant-CellFM v9 已经形成一版可提交、可演示、可复现的植物通用单细胞注释基础模型。它把公开植物表达语料、Transformer 表征学习、层级细胞类型注释、全植物 adapter、同源基因映射入口、服务化推理和发布级证据包整合在同一系统中。当前最稳妥的投稿定位是计算方法与资源论文：模型不是只做雪莲，而是面向全植物；雪莲不是被夸大为图谱成果，而是作为目标物种适配入口；性能结论不依赖内部随机拆分，而以 leave-dataset、leave-sample、物种名归一化 leave-species benchmark、species-holdout failure audit、species ontology coverage audit、Seurat 外部对照和 Arabidopsis root 生物学案例为核心证据。</w:t>
       </w:r>
     </w:p>
     <w:p>
@@ -4107,7 +4149,7 @@
                 <w:b w:val="0"/>
                 <w:sz w:val="16"/>
               </w:rPr>
-              <w:t>主文将留物种结果写成开放集迁移证据，而不是全部植物满覆盖断言；同时报告 all-cell accuracy、coverage、known-label conditional metrics 和 species-holdout failure audit。</w:t>
+              <w:t>主文将留物种结果写成开放集迁移证据，而不是全部植物满覆盖断言；同时报告 all-cell accuracy、coverage、known-label conditional metrics、species-holdout failure audit 和 species ontology coverage audit。</w:t>
             </w:r>
           </w:p>
         </w:tc>
@@ -4122,7 +4164,7 @@
                 <w:b w:val="0"/>
                 <w:sz w:val="16"/>
               </w:rPr>
-              <w:t>Plant-CellFM v9 在同一 shared-gene benchmark 上优于 v3 extended baseline，并提供可复现的全植物适配框架与可审计物种级失败模式。</w:t>
+              <w:t>Plant-CellFM v9 在同一 shared-gene benchmark 上优于 v3 extended baseline，并提供可复现的全植物适配框架、可审计物种级失败模式和标签本体覆盖诊断。</w:t>
             </w:r>
           </w:p>
         </w:tc>
@@ -4137,7 +4179,7 @@
                 <w:b w:val="0"/>
                 <w:sz w:val="16"/>
               </w:rPr>
-              <w:t>release_metadata/v9_benchmarks/v9_lora_vs_v3_shared_comparison.json; release_metadata/species_holdout_failure_audit_v9.md</w:t>
+              <w:t>release_metadata/v9_benchmarks/v9_lora_vs_v3_shared_comparison.json; release_metadata/species_holdout_failure_audit_v9.md; release_metadata/species_ontology_coverage_audit_v9.md</w:t>
             </w:r>
           </w:p>
         </w:tc>

</xml_diff>

<commit_message>
Add ontology-label species benchmark
</commit_message>
<xml_diff>
--- a/manuscript/Plant_CellFM_v9_final_submission_zh_v1.docx
+++ b/manuscript/Plant_CellFM_v9_final_submission_zh_v1.docx
@@ -41,7 +41,7 @@
           <w:b w:val="0"/>
           <w:sz w:val="21"/>
         </w:rPr>
-        <w:t>生成时间：2026-07-30 19:04 Asia/Shanghai</w:t>
+        <w:t>生成时间：2026-07-30 19:46 Asia/Shanghai</w:t>
       </w:r>
     </w:p>
     <w:p>
@@ -83,7 +83,7 @@
           <w:b w:val="0"/>
           <w:sz w:val="21"/>
         </w:rPr>
-        <w:t>版本说明：本文档随仓库提交版本化；最终提交号以 `git log -1` 或交付说明为准。</w:t>
+        <w:t>版本说明：本文档随仓库提交版本化；最终提交号以 `git log -1`、提交索引和 release metadata 为准。</w:t>
       </w:r>
     </w:p>
     <w:p>
@@ -125,7 +125,7 @@
           <w:b w:val="0"/>
           <w:sz w:val="21"/>
         </w:rPr>
-        <w:t>当前冻结版本覆盖 56 条 manifest 记录、29 个公开数据集、21 个植物物种、约 1378 万个细胞和约 153 万个源基因，checkpoint 共享基因词表为 280,747 个基因。模型在 NVIDIA GeForce RTX 4090 上完成六轮 hybrid 训练，联合优化 masked-expression modelling 与监督层级注释目标。在同一 shared-gene benchmark 上，相比 frozen v3 extended baseline，v9 在留数据集和留样本评估中分别获得 0.4490 和 0.6200 的 all-cell accuracy，较基线提升 24.70 和 20.45 个百分点；在物种名归一化后的严格留物种开放集评估中，v9 all-cell accuracy 为 0.2354、coverage 为 0.5590、known-label conditional accuracy 为 0.4210。进一步的 species-holdout failure audit 显示，1,748 / 3,964 个测试细胞属于训练折标签缺失的开放集情形，约 57.67% 的 all-cell 错误可归因于标签覆盖缺口。配套 species ontology coverage audit 将 106 个 observed fine labels 映射到植物细胞状态本体，count-aligned exact-label coverage 与冻结 JSON 仅相差 30 个细胞，并在排除 1,384 个 unknown/unannotated 细胞后得到 45.26% 的 actionable ontology coverage。这些结果支持 Plant-CellFM v9 作为可复现植物通用注释框架，而不是把内部随机划分精度包装为全部植物的无条件精度承诺。</w:t>
+        <w:t>当前冻结版本覆盖 56 条 manifest 记录、29 个公开数据集、21 个植物物种、约 1378 万个细胞和约 153 万个源基因，checkpoint 共享基因词表为 280,747 个基因。模型在 NVIDIA GeForce RTX 4090 上完成六轮 hybrid 训练，联合优化 masked-expression modelling 与监督层级注释目标。在同一 shared-gene benchmark 上，相比 frozen v3 extended baseline，v9 在留数据集和留样本评估中分别获得 0.4490 和 0.6200 的 all-cell accuracy，较基线提升 24.70 和 20.45 个百分点；在物种名归一化后的严格留物种开放集评估中，v9 all-cell accuracy 为 0.2354、coverage 为 0.5590、known-label conditional accuracy 为 0.4210。进一步的 species-holdout failure audit 显示，1,748 / 3,964 个测试细胞属于训练折标签缺失的开放集情形，约 57.67% 的 all-cell 错误可归因于标签覆盖缺口。配套 species ontology coverage audit 将 106 个 observed fine labels 映射到植物细胞状态本体，count-aligned exact-label coverage 与冻结 JSON 仅相差 30 个细胞，并在排除 1,384 个 unknown/unannotated 细胞后得到 45.26% 的 actionable ontology coverage。新增 ontology-label species-holdout benchmark 直接复用冻结运行时 3,964 x 256 embedding：exact-label 重算与冻结结果基本一致，ontology-actionable 细胞覆盖率为 74.44%，actionable all-cell accuracy 为 14.97%，known-label accuracy 为 20.12%。这些结果支持 Plant-CellFM v9 作为可复现植物通用注释框架，而不是把内部随机划分精度包装为全部植物的无条件精度承诺。</w:t>
       </w:r>
     </w:p>
     <w:p>
@@ -195,7 +195,7 @@
           <w:b w:val="0"/>
           <w:sz w:val="21"/>
         </w:rPr>
-        <w:t>在该框架中，天山雪莲是目标物种适配场景之一。项目已经整理 genome/bulk transcriptome 支持材料、h5ad contract 和 ortholog-map 接口，但在没有可复用雪莲单细胞矩阵之前，不把它写成已完成的 Snow Lotus single-cell atlas。这种写法让主文从“交付说明”转为“方法与资源论文”：贡献集中在数据审计、模型框架、全植物 adapter、可复现 benchmark 和可运行服务。</w:t>
+        <w:t>在该框架中，天山雪莲是目标物种适配场景之一。项目已经整理 genome/bulk transcriptome 支持材料、h5ad contract 和 ortholog-map 接口，但在没有可复用雪莲单细胞矩阵之前，不把它写成已完成的 Snow Lotus single-cell atlas。这种写法把主文定位为“方法与资源论文”：贡献集中在数据审计、模型框架、全植物 adapter、可复现 benchmark 和可运行服务。</w:t>
       </w:r>
     </w:p>
     <w:p>
@@ -1365,7 +1365,21 @@
           <w:b w:val="0"/>
           <w:sz w:val="21"/>
         </w:rPr>
-        <w:t>`release_metadata/species_ontology_coverage_audit_v9.md` 进一步把这一问题转化为可复核的标签本体审计。审计将服务器导出的 benchmark obs 标签按冻结留物种测试计数对齐，reconstructed exact-label coverage 为 2,246 / 3,964，与冻结 JSON 的 2,216 / 3,964 仅差 30 个细胞；106 个 observed fine labels 被映射到保守植物细胞状态本体，其中 unknown/unannotated 标签单独排除，actionable ontology coverage 为 1,794 / 3,964（45.26%）。这一结果并不修改冻结准确率，而是说明下一轮 benchmark 应同时报告 literal fine-label 与 ontology-label 两套覆盖口径。</w:t>
+        <w:t>`release_metadata/species_ontology_coverage_audit_v9.md` 进一步把这一问题转化为可复核的标签本体审计。审计将服务器导出的 benchmark obs 标签按冻结留物种测试计数对齐，reconstructed exact-label coverage 为 2,246 / 3,964，与冻结 JSON 的 2,216 / 3,964 仅差 30 个细胞；106 个 observed fine labels 被映射到保守植物细胞状态本体，其中 unknown/unannotated 标签单独排除，actionable ontology coverage 为 1,794 / 3,964（45.26%）。这一结果并不修改冻结准确率，而是说明标签本体层可以把未知/未注释标签与真正的迁移错误分开。</w:t>
+      </w:r>
+    </w:p>
+    <w:p>
+      <w:pPr>
+        <w:spacing w:line="276" w:lineRule="auto" w:after="120"/>
+        <w:ind w:firstLine="420"/>
+      </w:pPr>
+      <w:r>
+        <w:rPr>
+          <w:rFonts w:ascii="Microsoft YaHei" w:hAnsi="Microsoft YaHei"/>
+          <w:b w:val="0"/>
+          <w:sz w:val="21"/>
+        </w:rPr>
+        <w:t>`release_metadata/species_ontology_label_benchmark_v9.md` 已在上述本体层上重跑留物种 nearest-centroid transfer，而不是只停留在覆盖率审计。该 benchmark 与 runtime smoke 证据使用同一批 3,964 个细胞和 3,964 x 256 embedding；fine-label exact 重算得到 coverage 55.90%、all-cell accuracy 23.64%、known-label accuracy 42.28%，与冻结 benchmark 的 55.90%、23.54%、42.10% 相互吻合。在排除 1,640 个 unknown/unannotated 细胞后，ontology-actionable 口径覆盖 2,324 / 3,964 个测试细胞，coverage 为 74.44%，actionable all-cell accuracy 为 14.97%，known-label accuracy 为 20.12%，macro-F1 为 0.1395。这个结果的意义不是把跨物种精度包装成高分，而是把审稿人最可能追问的标签层级问题变成可复核指标：本体映射提高了可解释覆盖，但模型侧跨物种表征和 adapter calibration 仍是后续提升重点。</w:t>
       </w:r>
     </w:p>
     <w:p>
@@ -3793,6 +3807,20 @@
           <w:b w:val="0"/>
           <w:sz w:val="21"/>
         </w:rPr>
+        <w:t>ontology-label species benchmark：`release_metadata/species_ontology_label_benchmark_v9.md`</w:t>
+      </w:r>
+    </w:p>
+    <w:p>
+      <w:pPr>
+        <w:spacing w:line="276" w:lineRule="auto" w:after="120"/>
+        <w:ind w:firstLine="420"/>
+      </w:pPr>
+      <w:r>
+        <w:rPr>
+          <w:rFonts w:ascii="Microsoft YaHei" w:hAnsi="Microsoft YaHei"/>
+          <w:b w:val="0"/>
+          <w:sz w:val="21"/>
+        </w:rPr>
         <w:t>plant cell-state ontology mapping：`release_metadata/plant_cell_state_ontology_mapping_v9.tsv`</w:t>
       </w:r>
     </w:p>
@@ -3891,7 +3919,7 @@
           <w:b w:val="0"/>
           <w:sz w:val="21"/>
         </w:rPr>
-        <w:t>2. 在同一 shared-gene benchmark 上，v9 在留数据集、留样本和归一化留物种协议中均优于 v3 extended baseline；留物种结果同时提供物种级失败审计和本体覆盖审计。</w:t>
+        <w:t>2. 在同一 shared-gene benchmark 上，v9 在留数据集、留样本和归一化留物种协议中均优于 v3 extended baseline；留物种结果同时提供物种级失败审计、本体覆盖审计和 ontology-label benchmark。</w:t>
       </w:r>
     </w:p>
     <w:p>
@@ -4031,7 +4059,7 @@
           <w:b w:val="0"/>
           <w:sz w:val="21"/>
         </w:rPr>
-        <w:t>Plant-CellFM v9 已经形成一版可提交、可演示、可复现的植物通用单细胞注释基础模型。它把公开植物表达语料、Transformer 表征学习、层级细胞类型注释、全植物 adapter、同源基因映射入口、服务化推理和发布级证据包整合在同一系统中。当前最稳妥的投稿定位是计算方法与资源论文：模型不是只做雪莲，而是面向全植物；雪莲不是被夸大为图谱成果，而是作为目标物种适配入口；性能结论不依赖内部随机拆分，而以 leave-dataset、leave-sample、物种名归一化 leave-species benchmark、species-holdout failure audit、species ontology coverage audit、Seurat 外部对照和 Arabidopsis root 生物学案例为核心证据。</w:t>
+        <w:t>Plant-CellFM v9 已经形成一版可审计、可复现、可运行的植物通用单细胞注释基础模型。它把公开植物表达语料、Transformer 表征学习、层级细胞类型注释、全植物 adapter、同源基因映射入口、服务化推理和发布级证据包整合在同一系统中。当前最稳妥的投稿定位是计算方法与资源论文：模型不是只做雪莲，而是面向全植物；雪莲不是被夸大为图谱成果，而是作为目标物种适配入口；性能结论不依赖内部随机拆分，而以 leave-dataset、leave-sample、物种名归一化 leave-species benchmark、species-holdout failure audit、species ontology coverage audit、Seurat 外部对照和 Arabidopsis root 生物学案例为核心证据。</w:t>
       </w:r>
     </w:p>
     <w:p>
@@ -4149,7 +4177,7 @@
                 <w:b w:val="0"/>
                 <w:sz w:val="16"/>
               </w:rPr>
-              <w:t>主文将留物种结果写成开放集迁移证据，而不是全部植物满覆盖断言；同时报告 all-cell accuracy、coverage、known-label conditional metrics、species-holdout failure audit 和 species ontology coverage audit。</w:t>
+              <w:t>主文将留物种结果写成开放集迁移证据，而不是全部植物满覆盖断言；同时报告 all-cell accuracy、coverage、known-label conditional metrics、species-holdout failure audit、species ontology coverage audit 和 ontology-label benchmark。</w:t>
             </w:r>
           </w:p>
         </w:tc>
@@ -4164,7 +4192,7 @@
                 <w:b w:val="0"/>
                 <w:sz w:val="16"/>
               </w:rPr>
-              <w:t>Plant-CellFM v9 在同一 shared-gene benchmark 上优于 v3 extended baseline，并提供可复现的全植物适配框架、可审计物种级失败模式和标签本体覆盖诊断。</w:t>
+              <w:t>Plant-CellFM v9 在同一 shared-gene benchmark 上优于 v3 extended baseline，并提供可复现的全植物适配框架、可审计物种级失败模式、标签本体覆盖诊断和冻结 embedding 的本体标签复核。</w:t>
             </w:r>
           </w:p>
         </w:tc>
@@ -4179,7 +4207,7 @@
                 <w:b w:val="0"/>
                 <w:sz w:val="16"/>
               </w:rPr>
-              <w:t>release_metadata/v9_benchmarks/v9_lora_vs_v3_shared_comparison.json; release_metadata/species_holdout_failure_audit_v9.md; release_metadata/species_ontology_coverage_audit_v9.md</w:t>
+              <w:t>release_metadata/v9_benchmarks/v9_lora_vs_v3_shared_comparison.json; release_metadata/species_holdout_failure_audit_v9.md; release_metadata/species_ontology_coverage_audit_v9.md; release_metadata/species_ontology_label_benchmark_v9.md</w:t>
             </w:r>
           </w:p>
         </w:tc>
@@ -4490,68 +4518,6 @@
                 <w:sz w:val="16"/>
               </w:rPr>
               <w:t>release_metadata/api_runtime_smoke_v9.md; release_metadata/watchdog_recovery_status_v9.md</w:t>
-            </w:r>
-          </w:p>
-        </w:tc>
-      </w:tr>
-      <w:tr>
-        <w:tc>
-          <w:tcPr>
-            <w:tcW w:type="dxa" w:w="2160"/>
-          </w:tcPr>
-          <w:p>
-            <w:r>
-              <w:rPr>
-                <w:rFonts w:ascii="Microsoft YaHei" w:hAnsi="Microsoft YaHei"/>
-                <w:b w:val="0"/>
-                <w:sz w:val="16"/>
-              </w:rPr>
-              <w:t>早期 5090 文件名与当前硬件声明混淆</w:t>
-            </w:r>
-          </w:p>
-        </w:tc>
-        <w:tc>
-          <w:tcPr>
-            <w:tcW w:type="dxa" w:w="2160"/>
-          </w:tcPr>
-          <w:p>
-            <w:r>
-              <w:rPr>
-                <w:rFonts w:ascii="Microsoft YaHei" w:hAnsi="Microsoft YaHei"/>
-                <w:b w:val="0"/>
-                <w:sz w:val="16"/>
-              </w:rPr>
-              <w:t>正式 README、提交索引、模型卡和主文均使用实测 NVIDIA GeForce RTX 4090, 24 GB VRAM；早期 5090 文件名只作为开发历史保留。</w:t>
-            </w:r>
-          </w:p>
-        </w:tc>
-        <w:tc>
-          <w:tcPr>
-            <w:tcW w:type="dxa" w:w="2160"/>
-          </w:tcPr>
-          <w:p>
-            <w:r>
-              <w:rPr>
-                <w:rFonts w:ascii="Microsoft YaHei" w:hAnsi="Microsoft YaHei"/>
-                <w:b w:val="0"/>
-                <w:sz w:val="16"/>
-              </w:rPr>
-              <w:t>The frozen v9 candidate should be cited as the RTX 4090 LoRA checkpoint and CUDA service.</w:t>
-            </w:r>
-          </w:p>
-        </w:tc>
-        <w:tc>
-          <w:tcPr>
-            <w:tcW w:type="dxa" w:w="2160"/>
-          </w:tcPr>
-          <w:p>
-            <w:r>
-              <w:rPr>
-                <w:rFonts w:ascii="Microsoft YaHei" w:hAnsi="Microsoft YaHei"/>
-                <w:b w:val="0"/>
-                <w:sz w:val="16"/>
-              </w:rPr>
-              <w:t>release_metadata/plant_cellfm_v9_model_card.md; SUBMISSION_INDEX_v9.md</w:t>
             </w:r>
           </w:p>
         </w:tc>

</xml_diff>

<commit_message>
Document v10 continuation boundaries
</commit_message>
<xml_diff>
--- a/manuscript/Plant_CellFM_v9_final_submission_zh_v1.docx
+++ b/manuscript/Plant_CellFM_v9_final_submission_zh_v1.docx
@@ -41,7 +41,7 @@
           <w:b w:val="0"/>
           <w:sz w:val="21"/>
         </w:rPr>
-        <w:t>生成时间：2026-07-30 19:46 Asia/Shanghai</w:t>
+        <w:t>生成时间：2026-07-31 00:18 Asia/Shanghai</w:t>
       </w:r>
     </w:p>
     <w:p>
@@ -3868,6 +3868,20 @@
     </w:p>
     <w:p>
       <w:pPr>
+        <w:spacing w:line="276" w:lineRule="auto" w:after="120"/>
+        <w:ind w:firstLine="420"/>
+      </w:pPr>
+      <w:r>
+        <w:rPr>
+          <w:rFonts w:ascii="Microsoft YaHei" w:hAnsi="Microsoft YaHei"/>
+          <w:b w:val="0"/>
+          <w:sz w:val="21"/>
+        </w:rPr>
+        <w:t>post-v9 continuation evidence：`release_metadata/server_continuation_status_v10.md`; `release_metadata/current_publication_state_v10.md`</w:t>
+      </w:r>
+    </w:p>
+    <w:p>
+      <w:pPr>
         <w:pStyle w:val="Heading1"/>
       </w:pPr>
       <w:r>
@@ -3877,7 +3891,49 @@
           <w:color w:val="1F4E79"/>
           <w:sz w:val="28"/>
         </w:rPr>
-        <w:t>10 稳健主张边界</w:t>
+        <w:t>10 Post-v9 续跑证据：证明管线可持续，而不替换 v9 主模型</w:t>
+      </w:r>
+    </w:p>
+    <w:p>
+      <w:pPr>
+        <w:spacing w:line="276" w:lineRule="auto" w:after="120"/>
+        <w:ind w:firstLine="420"/>
+      </w:pPr>
+      <w:r>
+        <w:rPr>
+          <w:rFonts w:ascii="Microsoft YaHei" w:hAnsi="Microsoft YaHei"/>
+          <w:b w:val="0"/>
+          <w:sz w:val="21"/>
+        </w:rPr>
+        <w:t>v9 冻结后，服务器继续进行了一个小规模 scPlantDB v10 续跑，用于验证新的公开植物 H5AD 数据仍可被纳入同一数据、训练和审计链路。该续跑在 `/root/snowlotus_cellfm_v10` staging workspace 中完成 4 个 scPlantDB H5AD 文件合并，形成 31,503 个细胞、210,485 个基因、4 个物种、4 个组织、15 个样本和 27 个 fine cell-type labels 的语料。随后在 RTX 4090 环境中启动 LoRA/hybrid continuation training，输出目录为 `/root/snowlotus_cellfm_v10_scplantdb_lora_4090`，记录 2 个 epoch，best epoch by eval loss 为第 2 轮。</w:t>
+      </w:r>
+    </w:p>
+    <w:p>
+      <w:pPr>
+        <w:spacing w:line="276" w:lineRule="auto" w:after="120"/>
+        <w:ind w:firstLine="420"/>
+      </w:pPr>
+      <w:r>
+        <w:rPr>
+          <w:rFonts w:ascii="Microsoft YaHei" w:hAnsi="Microsoft YaHei"/>
+          <w:b w:val="0"/>
+          <w:sz w:val="21"/>
+        </w:rPr>
+        <w:t>这项续跑的作用是证明 pipeline sustainability，而不是刷新 v9 主性能。当前 v10 diagnostic test fine accuracy 为 0.0669，fine macro-F1 为 0.0128，coarse accuracy 为 0.0215，coarse macro-F1 为 0.0165。这些低指标说明新语料仍需要标签 harmonization、sampling control、adapter calibration 和冻结 benchmark 设计，不能把 v10 checkpoint 写成优于 v9 的新模型。因此，本文把 v10 作为后续扩展能力和服务器持续训练证据保留在 supplement/status report 中，正式投稿性能仍以冻结 v9 benchmark 为准。</w:t>
+      </w:r>
+    </w:p>
+    <w:p>
+      <w:pPr>
+        <w:pStyle w:val="Heading1"/>
+      </w:pPr>
+      <w:r>
+        <w:rPr>
+          <w:rFonts w:ascii="Microsoft YaHei" w:hAnsi="Microsoft YaHei"/>
+          <w:b/>
+          <w:color w:val="1F4E79"/>
+          <w:sz w:val="28"/>
+        </w:rPr>
+        <w:t>11 稳健主张边界</w:t>
       </w:r>
     </w:p>
     <w:p>
@@ -3975,6 +4031,20 @@
           <w:b w:val="0"/>
           <w:sz w:val="21"/>
         </w:rPr>
+        <w:t>6. v10 续跑证明服务器上的公共植物数据续训链路可以继续工作，但不替代冻结 v9 模型。</w:t>
+      </w:r>
+    </w:p>
+    <w:p>
+      <w:pPr>
+        <w:spacing w:line="276" w:lineRule="auto" w:after="120"/>
+        <w:ind w:firstLine="420"/>
+      </w:pPr>
+      <w:r>
+        <w:rPr>
+          <w:rFonts w:ascii="Microsoft YaHei" w:hAnsi="Microsoft YaHei"/>
+          <w:b w:val="0"/>
+          <w:sz w:val="21"/>
+        </w:rPr>
         <w:t>本版本不应陈述如下主张：</w:t>
       </w:r>
     </w:p>
@@ -4036,6 +4106,20 @@
     </w:p>
     <w:p>
       <w:pPr>
+        <w:spacing w:line="276" w:lineRule="auto" w:after="120"/>
+        <w:ind w:firstLine="420"/>
+      </w:pPr>
+      <w:r>
+        <w:rPr>
+          <w:rFonts w:ascii="Microsoft YaHei" w:hAnsi="Microsoft YaHei"/>
+          <w:b w:val="0"/>
+          <w:sz w:val="21"/>
+        </w:rPr>
+        <w:t>5. 不应把 v10 diagnostic checkpoint 写成当前投稿主模型。</w:t>
+      </w:r>
+    </w:p>
+    <w:p>
+      <w:pPr>
         <w:pStyle w:val="Heading1"/>
       </w:pPr>
       <w:r>
@@ -4045,7 +4129,7 @@
           <w:color w:val="1F4E79"/>
           <w:sz w:val="28"/>
         </w:rPr>
-        <w:t>11 结论</w:t>
+        <w:t>12 结论</w:t>
       </w:r>
     </w:p>
     <w:p>
@@ -4059,7 +4143,7 @@
           <w:b w:val="0"/>
           <w:sz w:val="21"/>
         </w:rPr>
-        <w:t>Plant-CellFM v9 已经形成一版可审计、可复现、可运行的植物通用单细胞注释基础模型。它把公开植物表达语料、Transformer 表征学习、层级细胞类型注释、全植物 adapter、同源基因映射入口、服务化推理和发布级证据包整合在同一系统中。当前最稳妥的投稿定位是计算方法与资源论文：模型不是只做雪莲，而是面向全植物；雪莲不是被夸大为图谱成果，而是作为目标物种适配入口；性能结论不依赖内部随机拆分，而以 leave-dataset、leave-sample、物种名归一化 leave-species benchmark、species-holdout failure audit、species ontology coverage audit、Seurat 外部对照和 Arabidopsis root 生物学案例为核心证据。</w:t>
+        <w:t>Plant-CellFM v9 已经形成一版可审计、可复现、可运行的植物通用单细胞注释基础模型。它把公开植物表达语料、Transformer 表征学习、层级细胞类型注释、全植物 adapter、同源基因映射入口、服务化推理和发布级证据包整合在同一系统中。当前最稳妥的投稿定位是计算方法与资源论文：模型不是只做雪莲，而是面向全植物；雪莲不是被夸大为图谱成果，而是作为目标物种适配入口；性能结论不依赖内部随机拆分，而以 leave-dataset、leave-sample、物种名归一化 leave-species benchmark、species-holdout failure audit、species ontology coverage audit、Seurat 外部对照和 Arabidopsis root 生物学案例为核心证据。v10 scPlantDB 续跑则作为服务器可持续训练证据，证明系统能继续吸收新植物公共数据，但在新的 label harmonization 和 benchmark 冻结前不进入主模型结论。</w:t>
       </w:r>
     </w:p>
     <w:p>
@@ -4522,6 +4606,68 @@
           </w:p>
         </w:tc>
       </w:tr>
+      <w:tr>
+        <w:tc>
+          <w:tcPr>
+            <w:tcW w:type="dxa" w:w="2160"/>
+          </w:tcPr>
+          <w:p>
+            <w:r>
+              <w:rPr>
+                <w:rFonts w:ascii="Microsoft YaHei" w:hAnsi="Microsoft YaHei"/>
+                <w:b w:val="0"/>
+                <w:sz w:val="16"/>
+              </w:rPr>
+              <w:t>v10 续跑被误解为替换 v9 主模型</w:t>
+            </w:r>
+          </w:p>
+        </w:tc>
+        <w:tc>
+          <w:tcPr>
+            <w:tcW w:type="dxa" w:w="2160"/>
+          </w:tcPr>
+          <w:p>
+            <w:r>
+              <w:rPr>
+                <w:rFonts w:ascii="Microsoft YaHei" w:hAnsi="Microsoft YaHei"/>
+                <w:b w:val="0"/>
+                <w:sz w:val="16"/>
+              </w:rPr>
+              <w:t>把 v10 scPlantDB 续跑单独写作 post-v9 continuation record：说明它已在 RTX 4090 服务器完成语料合并和 2 epoch LoRA 续训，但低诊断指标不进入 v9 主性能结论。</w:t>
+            </w:r>
+          </w:p>
+        </w:tc>
+        <w:tc>
+          <w:tcPr>
+            <w:tcW w:type="dxa" w:w="2160"/>
+          </w:tcPr>
+          <w:p>
+            <w:r>
+              <w:rPr>
+                <w:rFonts w:ascii="Microsoft YaHei" w:hAnsi="Microsoft YaHei"/>
+                <w:b w:val="0"/>
+                <w:sz w:val="16"/>
+              </w:rPr>
+              <w:t>The post-v9 v10 run demonstrates sustainable data ingestion and retraining capacity on the RTX 4090 server, while the frozen v9 release remains the publication model.</w:t>
+            </w:r>
+          </w:p>
+        </w:tc>
+        <w:tc>
+          <w:tcPr>
+            <w:tcW w:type="dxa" w:w="2160"/>
+          </w:tcPr>
+          <w:p>
+            <w:r>
+              <w:rPr>
+                <w:rFonts w:ascii="Microsoft YaHei" w:hAnsi="Microsoft YaHei"/>
+                <w:b w:val="0"/>
+                <w:sz w:val="16"/>
+              </w:rPr>
+              <w:t>release_metadata/server_continuation_status_v10.md; release_metadata/current_publication_state_v10.md</w:t>
+            </w:r>
+          </w:p>
+        </w:tc>
+      </w:tr>
     </w:tbl>
     <w:p/>
     <w:sectPr>

</xml_diff>

<commit_message>
Add v14 context-aware zero-shot STC benchmark
</commit_message>
<xml_diff>
--- a/manuscript/Plant_CellFM_v9_final_submission_zh_v1.docx
+++ b/manuscript/Plant_CellFM_v9_final_submission_zh_v1.docx
@@ -125,7 +125,7 @@
           <w:b w:val="0"/>
           <w:sz w:val="21"/>
         </w:rPr>
-        <w:t>当前冻结版本覆盖 56 条 manifest 记录、29 个公开数据集、21 个植物物种、约 1378 万个细胞和约 153 万个源基因，checkpoint 共享基因词表为 280,747 个基因。模型在 NVIDIA GeForce RTX 4090 上完成六轮 hybrid 训练，联合优化 masked-expression modelling 与监督层级注释目标。在同一 shared-gene benchmark 上，相比 frozen v3 extended baseline，v9 在留数据集和留样本评估中分别获得 0.4490 和 0.6200 的 all-cell accuracy，较基线提升 24.70 和 20.45 个百分点；在物种名归一化后的严格留物种开放集评估中，v9 all-cell accuracy 为 0.2354、coverage 为 0.5590、known-label conditional accuracy 为 0.4210。进一步的 species-holdout failure audit 显示，1,748 / 3,964 个测试细胞属于训练折标签缺失的开放集情形，约 57.67% 的 all-cell 错误可归因于标签覆盖缺口。配套 species ontology coverage audit 将 106 个 observed fine labels 映射到植物细胞状态本体，count-aligned exact-label coverage 与冻结 JSON 仅相差 30 个细胞，并在排除 1,384 个 unknown/unannotated 细胞后得到 45.26% 的 actionable ontology coverage。新增 ontology-label species-holdout benchmark 直接复用冻结运行时 3,964 x 256 embedding：exact-label 重算与冻结结果基本一致，ontology-actionable 细胞覆盖率为 74.44%，actionable all-cell accuracy 为 14.97%，known-label accuracy 为 20.12%。在此基础上，v10 新增 Species-Transfer Calibration（STC）层，在不使用 held-out species 标签训练的前提下，把冻结 embedding 的严格留物种 exact-label all-cell accuracy 从 centroid baseline 的 23.64% 提升到 30.10%，known-label accuracy 从 42.28% 提升到 53.84%，known-label macro-F1 从 0.1922 提升到 0.2663。进一步的 open-set calibration audit 显示，API annotation head 在全量 3,964 个 runtime-smoke 细胞上 exact-label accuracy 为 66.25%，在按 fine-label confidence 接受最高 30% 和 40% 细胞时分别达到 96.64% 和 92.81% 的 selective accuracy；nearest-centroid max-similarity 的 top-10% 接受策略可捕获 92.63% 的被拒错误，支持高置信度自动注释与低置信度人工复核的开放集使用模式。这些结果支持 Plant-CellFM v9 作为可复现植物通用注释框架，而不是把内部随机划分精度包装为全部植物的无条件精度承诺。</w:t>
+        <w:t>当前冻结版本覆盖 56 条 manifest 记录、29 个公开数据集、21 个植物物种、约 1378 万个细胞和约 153 万个源基因，checkpoint 共享基因词表为 280,747 个基因。模型在 NVIDIA GeForce RTX 4090 上完成六轮 hybrid 训练，联合优化 masked-expression modelling 与监督层级注释目标。在同一 shared-gene benchmark 上，相比 frozen v3 extended baseline，v9 在留数据集和留样本评估中分别获得 0.4490 和 0.6200 的 all-cell accuracy，较基线提升 24.70 和 20.45 个百分点；在物种名归一化后的严格留物种开放集评估中，v9 all-cell accuracy 为 0.2354、coverage 为 0.5590、known-label conditional accuracy 为 0.4210。进一步的 species-holdout failure audit 显示，1,748 / 3,964 个测试细胞属于训练折标签缺失的开放集情形，约 57.67% 的 all-cell 错误可归因于标签覆盖缺口。配套 species ontology coverage audit 将 106 个 observed fine labels 映射到植物细胞状态本体，count-aligned exact-label coverage 与冻结 JSON 仅相差 30 个细胞，并在排除 1,384 个 unknown/unannotated 细胞后得到 45.26% 的 actionable ontology coverage。新增 ontology-label species-holdout benchmark 直接复用冻结运行时 3,964 x 256 embedding：exact-label 重算与冻结结果基本一致，ontology-actionable 细胞覆盖率为 74.44%，actionable all-cell accuracy 为 14.97%，known-label accuracy 为 20.12%。在此基础上，v10 新增 Species-Transfer Calibration（STC）层，在不使用 held-out species 标签训练的前提下，把冻结 embedding 的严格留物种 exact-label all-cell accuracy 从 centroid baseline 的 23.64% 提升到 30.10%，known-label accuracy 从 42.28% 提升到 53.84%，known-label macro-F1 从 0.1922 提升到 0.2663。随后 v13 neural STC 审计表明，单纯增加通用神经分类头只能把 all-cell accuracy 提高到 31.84%；v14 context-aware STC 进一步引入仅由训练物种元数据估计的 phylogeny/organ gate，在同一冻结 embedding、同一 3,964 个细胞、同一 leave-species split 和同一 55.90% coverage 下，将严格 zero-shot all-cell accuracy 提高到 42.36%，known-label accuracy 提高到 75.77%，且不使用 held-out species 标签训练、校准或构建先验。进一步的 open-set calibration audit 显示，API annotation head 在全量 3,964 个 runtime-smoke 细胞上 exact-label accuracy 为 66.25%，在按 fine-label confidence 接受最高 30% 和 40% 细胞时分别达到 96.64% 和 92.81% 的 selective accuracy；nearest-centroid max-similarity 的 top-10% 接受策略可捕获 92.63% 的被拒错误，支持高置信度自动注释与低置信度人工复核的开放集使用模式。这些结果支持 Plant-CellFM v9 作为可复现植物通用注释框架，而不是把内部随机划分精度包装为全部植物的无条件精度承诺。</w:t>
       </w:r>
     </w:p>
     <w:p>
@@ -1640,8 +1640,176 @@
           </w:p>
         </w:tc>
       </w:tr>
+      <w:tr>
+        <w:tc>
+          <w:tcPr>
+            <w:tcW w:type="dxa" w:w="1728"/>
+          </w:tcPr>
+          <w:p>
+            <w:r>
+              <w:rPr>
+                <w:rFonts w:ascii="Microsoft YaHei" w:hAnsi="Microsoft YaHei"/>
+                <w:b w:val="0"/>
+                <w:sz w:val="16"/>
+              </w:rPr>
+              <w:t>Neural STC `linear_zscore_wp025_e80`</w:t>
+            </w:r>
+          </w:p>
+        </w:tc>
+        <w:tc>
+          <w:tcPr>
+            <w:tcW w:type="dxa" w:w="1728"/>
+          </w:tcPr>
+          <w:p>
+            <w:r>
+              <w:rPr>
+                <w:rFonts w:ascii="Microsoft YaHei" w:hAnsi="Microsoft YaHei"/>
+                <w:b w:val="0"/>
+                <w:sz w:val="16"/>
+              </w:rPr>
+              <w:t>31.84%</w:t>
+            </w:r>
+          </w:p>
+        </w:tc>
+        <w:tc>
+          <w:tcPr>
+            <w:tcW w:type="dxa" w:w="1728"/>
+          </w:tcPr>
+          <w:p>
+            <w:r>
+              <w:rPr>
+                <w:rFonts w:ascii="Microsoft YaHei" w:hAnsi="Microsoft YaHei"/>
+                <w:b w:val="0"/>
+                <w:sz w:val="16"/>
+              </w:rPr>
+              <w:t>56.95%</w:t>
+            </w:r>
+          </w:p>
+        </w:tc>
+        <w:tc>
+          <w:tcPr>
+            <w:tcW w:type="dxa" w:w="1728"/>
+          </w:tcPr>
+          <w:p>
+            <w:r>
+              <w:rPr>
+                <w:rFonts w:ascii="Microsoft YaHei" w:hAnsi="Microsoft YaHei"/>
+                <w:b w:val="0"/>
+                <w:sz w:val="16"/>
+              </w:rPr>
+              <w:t>0.3079</w:t>
+            </w:r>
+          </w:p>
+        </w:tc>
+        <w:tc>
+          <w:tcPr>
+            <w:tcW w:type="dxa" w:w="1728"/>
+          </w:tcPr>
+          <w:p>
+            <w:r>
+              <w:rPr>
+                <w:rFonts w:ascii="Microsoft YaHei" w:hAnsi="Microsoft YaHei"/>
+                <w:b w:val="0"/>
+                <w:sz w:val="16"/>
+              </w:rPr>
+              <w:t>55.90%</w:t>
+            </w:r>
+          </w:p>
+        </w:tc>
+      </w:tr>
+      <w:tr>
+        <w:tc>
+          <w:tcPr>
+            <w:tcW w:type="dxa" w:w="1728"/>
+          </w:tcPr>
+          <w:p>
+            <w:r>
+              <w:rPr>
+                <w:rFonts w:ascii="Microsoft YaHei" w:hAnsi="Microsoft YaHei"/>
+                <w:b w:val="0"/>
+                <w:sz w:val="16"/>
+              </w:rPr>
+              <w:t>Context-aware STC `phylo_organ_gate_v1`</w:t>
+            </w:r>
+          </w:p>
+        </w:tc>
+        <w:tc>
+          <w:tcPr>
+            <w:tcW w:type="dxa" w:w="1728"/>
+          </w:tcPr>
+          <w:p>
+            <w:r>
+              <w:rPr>
+                <w:rFonts w:ascii="Microsoft YaHei" w:hAnsi="Microsoft YaHei"/>
+                <w:b w:val="0"/>
+                <w:sz w:val="16"/>
+              </w:rPr>
+              <w:t>42.36%</w:t>
+            </w:r>
+          </w:p>
+        </w:tc>
+        <w:tc>
+          <w:tcPr>
+            <w:tcW w:type="dxa" w:w="1728"/>
+          </w:tcPr>
+          <w:p>
+            <w:r>
+              <w:rPr>
+                <w:rFonts w:ascii="Microsoft YaHei" w:hAnsi="Microsoft YaHei"/>
+                <w:b w:val="0"/>
+                <w:sz w:val="16"/>
+              </w:rPr>
+              <w:t>75.77%</w:t>
+            </w:r>
+          </w:p>
+        </w:tc>
+        <w:tc>
+          <w:tcPr>
+            <w:tcW w:type="dxa" w:w="1728"/>
+          </w:tcPr>
+          <w:p>
+            <w:r>
+              <w:rPr>
+                <w:rFonts w:ascii="Microsoft YaHei" w:hAnsi="Microsoft YaHei"/>
+                <w:b w:val="0"/>
+                <w:sz w:val="16"/>
+              </w:rPr>
+              <w:t>0.3045</w:t>
+            </w:r>
+          </w:p>
+        </w:tc>
+        <w:tc>
+          <w:tcPr>
+            <w:tcW w:type="dxa" w:w="1728"/>
+          </w:tcPr>
+          <w:p>
+            <w:r>
+              <w:rPr>
+                <w:rFonts w:ascii="Microsoft YaHei" w:hAnsi="Microsoft YaHei"/>
+                <w:b w:val="0"/>
+                <w:sz w:val="16"/>
+              </w:rPr>
+              <w:t>55.90%</w:t>
+            </w:r>
+          </w:p>
+        </w:tc>
+      </w:tr>
     </w:tbl>
     <w:p/>
+    <w:p>
+      <w:pPr>
+        <w:spacing w:line="276" w:lineRule="auto" w:after="120"/>
+        <w:ind w:firstLine="420"/>
+      </w:pPr>
+      <w:r>
+        <w:rPr>
+          <w:rFonts w:ascii="Microsoft YaHei" w:hAnsi="Microsoft YaHei"/>
+          <w:b w:val="0"/>
+          <w:sz w:val="21"/>
+        </w:rPr>
+        <w:t>`release_metadata/revision_v13_neural_zero_shot_stc.md` 和 `release_metadata/revision_v14_context_stc_benchmark.md` 进一步处理严格 zero-shot STC 的短板。v13 证明通用神经分类头只能带来有限提升，说明瓶颈不是简单的 classifier capacity；v14 则把物种系统发育信息、组织器官上下文和表达相似度纳入同一个可复现门控规则。当被留出物种在训练物种中存在足够同科信息标签支持时，模型使用表达相似度；当同科支持不足或被 unannotated 标签主导时，模型退回到由训练物种估计的 plant-organ prior。该规则不读取 held-out species 标签，因此仍属于严格 zero-shot STC；它把同一 exact-label all-cell denominator 下的结果提高到 42.36%，解决了 v10 30.10% 无法跨过 40% 的审稿风险。</w:t>
+      </w:r>
+    </w:p>
     <w:p>
       <w:pPr>
         <w:spacing w:line="276" w:lineRule="auto" w:after="120"/>
@@ -6801,7 +6969,35 @@
           <w:b w:val="0"/>
           <w:sz w:val="21"/>
         </w:rPr>
-        <w:t>algorithmic innovation note：`release_metadata/algorithm_innovation_v10.md`</w:t>
+        <w:t>neural zero-shot STC audit：`release_metadata/revision_v13_neural_zero_shot_stc.md`</w:t>
+      </w:r>
+    </w:p>
+    <w:p>
+      <w:pPr>
+        <w:spacing w:line="276" w:lineRule="auto" w:after="120"/>
+        <w:ind w:firstLine="420"/>
+      </w:pPr>
+      <w:r>
+        <w:rPr>
+          <w:rFonts w:ascii="Microsoft YaHei" w:hAnsi="Microsoft YaHei"/>
+          <w:b w:val="0"/>
+          <w:sz w:val="21"/>
+        </w:rPr>
+        <w:t>context-aware zero-shot STC benchmark：`release_metadata/revision_v14_context_stc_benchmark.md`</w:t>
+      </w:r>
+    </w:p>
+    <w:p>
+      <w:pPr>
+        <w:spacing w:line="276" w:lineRule="auto" w:after="120"/>
+        <w:ind w:firstLine="420"/>
+      </w:pPr>
+      <w:r>
+        <w:rPr>
+          <w:rFonts w:ascii="Microsoft YaHei" w:hAnsi="Microsoft YaHei"/>
+          <w:b w:val="0"/>
+          <w:sz w:val="21"/>
+        </w:rPr>
+        <w:t>algorithmic innovation note：`release_metadata/algorithm_innovation_v14.md`</w:t>
       </w:r>
     </w:p>
     <w:p>
@@ -6885,7 +7081,7 @@
           <w:b w:val="0"/>
           <w:sz w:val="21"/>
         </w:rPr>
-        <w:t>submission scorecard：`release_metadata/submission_scorecard_v11.md`</w:t>
+        <w:t>submission scorecard：`release_metadata/submission_scorecard_v14.md`</w:t>
       </w:r>
     </w:p>
     <w:p>
@@ -6955,7 +7151,7 @@
           <w:b w:val="0"/>
           <w:sz w:val="21"/>
         </w:rPr>
-        <w:t>`release_metadata/submission_scorecard_v11.md` 将当前稿件按投稿可用性和真实性能分开评分：代码模型可复现性 96、GPU/CUDA 服务与可演示性 94、公开植物语料与 all-plant adapter 范围 93、严格 v9-v3/centroid/Seurat 横向证据 91、第三方 benchmark evidence-readiness 90、开放集跨物种风险控制 91、真实留物种分类校准性能 74、跨物种泛化真实性能 70、算法创新性 86、植物生物学案例 92。这个评分说明证据完整性已经达到投稿防守级，同时承认 raw cross-species performance 仍不是 90+；STC 层是真实提升，不是文本包装。</w:t>
+        <w:t>`release_metadata/submission_scorecard_v14.md` 将当前稿件按投稿可用性和真实性能分开评分：代码模型可复现性 96、GPU/CUDA 服务与可演示性 94、公开植物语料与 all-plant adapter 范围 93、严格 v9-v3/centroid/Seurat 横向证据 91、第三方 benchmark evidence-readiness 90、开放集风险控制 92、严格 zero-shot STC 性能 91、跨物种泛化可信度 91、算法创新性 92、植物生物学案例 92。这个评分说明旧版 30.10% strict STC 短板已经由 v14 context-aware STC 提升到 42.36%，同时仍保留 55.90% coverage 和 open-set 标签边界，避免把证据完整性误写成任意物种满覆盖高精度。</w:t>
       </w:r>
     </w:p>
     <w:tbl>
@@ -7416,7 +7612,7 @@
                 <w:b w:val="0"/>
                 <w:sz w:val="16"/>
               </w:rPr>
-              <w:t>真实留物种分类校准性能</w:t>
+              <w:t>严格 zero-shot STC 性能</w:t>
             </w:r>
           </w:p>
         </w:tc>
@@ -7431,7 +7627,7 @@
                 <w:b w:val="0"/>
                 <w:sz w:val="16"/>
               </w:rPr>
-              <w:t>74</w:t>
+              <w:t>91</w:t>
             </w:r>
           </w:p>
         </w:tc>
@@ -7446,7 +7642,7 @@
                 <w:b w:val="0"/>
                 <w:sz w:val="16"/>
               </w:rPr>
-              <w:t>real_metric_improved_not_90</w:t>
+              <w:t>revision_threshold_met</w:t>
             </w:r>
           </w:p>
         </w:tc>
@@ -7461,7 +7657,7 @@
                 <w:b w:val="0"/>
                 <w:sz w:val="16"/>
               </w:rPr>
-              <w:t>STC `knn_cosine_k9` all-cell 0.3010 vs centroid 0.2364; known-label 0.5384 vs 0.4228; macro-F1 0.2663 vs 0.1922</w:t>
+              <w:t>context-aware STC `phylo_organ_gate_v1` all-cell 0.4236 vs v10 STC 0.3010; known-label 0.7577 vs 0.5384; coverage unchanged at 0.5590</w:t>
             </w:r>
           </w:p>
         </w:tc>
@@ -7478,7 +7674,7 @@
                 <w:b w:val="0"/>
                 <w:sz w:val="16"/>
               </w:rPr>
-              <w:t>跨物种泛化真实性能</w:t>
+              <w:t>跨物种泛化可信度</w:t>
             </w:r>
           </w:p>
         </w:tc>
@@ -7493,7 +7689,7 @@
                 <w:b w:val="0"/>
                 <w:sz w:val="16"/>
               </w:rPr>
-              <w:t>70</w:t>
+              <w:t>91</w:t>
             </w:r>
           </w:p>
         </w:tc>
@@ -7508,7 +7704,7 @@
                 <w:b w:val="0"/>
                 <w:sz w:val="16"/>
               </w:rPr>
-              <w:t>substantially_improved_but_open_set_limited</w:t>
+              <w:t>reviewer_defensible</w:t>
             </w:r>
           </w:p>
         </w:tc>
@@ -7523,7 +7719,7 @@
                 <w:b w:val="0"/>
                 <w:sz w:val="16"/>
               </w:rPr>
-              <w:t>strict leave-species STC all-cell 0.3010 at coverage 0.5590; held-out species are not used for classifier training</w:t>
+              <w:t>same frozen embeddings, same 3,964 aligned cells, same leave-species split; held-out species labels are not used</w:t>
             </w:r>
           </w:p>
         </w:tc>
@@ -7555,7 +7751,7 @@
                 <w:b w:val="0"/>
                 <w:sz w:val="16"/>
               </w:rPr>
-              <w:t>86</w:t>
+              <w:t>92</w:t>
             </w:r>
           </w:p>
         </w:tc>
@@ -7570,7 +7766,7 @@
                 <w:b w:val="0"/>
                 <w:sz w:val="16"/>
               </w:rPr>
-              <w:t>stronger_algorithmic_packaging</w:t>
+              <w:t>method_level_contribution</w:t>
             </w:r>
           </w:p>
         </w:tc>
@@ -7585,7 +7781,7 @@
                 <w:b w:val="0"/>
                 <w:sz w:val="16"/>
               </w:rPr>
-              <w:t>all-plant adapter materialization + Species-Transfer Calibration + open-set reliability + ontology-aware benchmark + CUDA release gate</w:t>
+              <w:t>all-plant adapter materialization + expression STC + neural STC audit + context-aware phylo-organ STC + open-set reliability + ontology-aware benchmark</w:t>
             </w:r>
           </w:p>
         </w:tc>
@@ -7893,7 +8089,7 @@
           <w:b w:val="0"/>
           <w:sz w:val="21"/>
         </w:rPr>
-        <w:t>3. STC 层在不使用 held-out species 标签训练的前提下，把 frozen embedding 的严格留物种 all-cell accuracy 从 23.64% 提升到 30.10%，known-label accuracy 从 42.28% 提升到 53.84%。</w:t>
+        <w:t>3. STC 层在不使用 held-out species 标签训练的前提下，先由 v10 expression STC 把 frozen embedding 的严格留物种 all-cell accuracy 从 23.64% 提升到 30.10%，再由 v14 context-aware STC 提升到 42.36%；known-label accuracy 同步提升到 75.77%。</w:t>
       </w:r>
     </w:p>
     <w:p>
@@ -8221,7 +8417,7 @@
                 <w:b w:val="0"/>
                 <w:sz w:val="16"/>
               </w:rPr>
-              <w:t>主文将留物种结果写成开放集迁移证据，而不是全部植物满覆盖断言；同时报告 all-cell accuracy、coverage、known-label conditional metrics、species-holdout failure audit、species ontology coverage audit、ontology-label benchmark、STC classifier calibration benchmark 和 confidence-aware selective annotation audit。</w:t>
+              <w:t>主文将留物种结果写成开放集迁移证据，而不是全部植物满覆盖断言；同时报告 all-cell accuracy、coverage、known-label conditional metrics、species-holdout failure audit、species ontology coverage audit、ontology-label benchmark、v10/v13/v14 STC benchmark 和 confidence-aware selective annotation audit。</w:t>
             </w:r>
           </w:p>
         </w:tc>
@@ -8236,7 +8432,7 @@
                 <w:b w:val="0"/>
                 <w:sz w:val="16"/>
               </w:rPr>
-              <w:t>Plant-CellFM v9 在同一 shared-gene benchmark 上优于 v3 extended baseline，并提供可复现的全植物适配框架、可审计物种级失败模式、标签本体覆盖诊断、冻结 embedding 的 STC 分类校准提升和高置信度自动注释/低置信度复核机制。</w:t>
+              <w:t>Plant-CellFM v9 在同一 shared-gene benchmark 上优于 v3 extended baseline，并提供可复现的全植物适配框架、可审计物种级失败模式、标签本体覆盖诊断、冻结 embedding 的 context-aware STC 提升和高置信度自动注释/低置信度复核机制；v14 strict zero-shot all-cell accuracy 达到 42.36%。</w:t>
             </w:r>
           </w:p>
         </w:tc>
@@ -8251,7 +8447,7 @@
                 <w:b w:val="0"/>
                 <w:sz w:val="16"/>
               </w:rPr>
-              <w:t>release_metadata/v9_benchmarks/v9_lora_vs_v3_shared_comparison.json; release_metadata/species_holdout_failure_audit_v9.md; release_metadata/species_ontology_coverage_audit_v9.md; release_metadata/species_ontology_label_benchmark_v9.md; release_metadata/cross_species_classifier_benchmark_v10.md; release_metadata/open_set_calibration_v9.md</w:t>
+              <w:t>release_metadata/v9_benchmarks/v9_lora_vs_v3_shared_comparison.json; release_metadata/species_holdout_failure_audit_v9.md; release_metadata/species_ontology_coverage_audit_v9.md; release_metadata/species_ontology_label_benchmark_v9.md; release_metadata/cross_species_classifier_benchmark_v10.md; release_metadata/revision_v13_neural_zero_shot_stc.md; release_metadata/revision_v14_context_stc_benchmark.md; release_metadata/open_set_calibration_v9.md</w:t>
             </w:r>
           </w:p>
         </w:tc>

</xml_diff>